<commit_message>
Select embedding model and fix the vector dimension
Spike NOVA-SPK-002: five candidates over 20 requirements and 24 labelled
rules. embeddinggemma at 768. Closes R-04 and G1, so the schema is
unblocked.

Also found that a rule applying to everything never reaches the top five
for anything, which is why DL-029 pulls always-apply rules out of the
index.
</commit_message>
<xml_diff>
--- a/docs/dist/adr/README.docx
+++ b/docs/dist/adr/README.docx
@@ -379,29 +379,38 @@
               <w:pStyle w:val="Compact"/>
             </w:pPr>
             <w:r>
-              <w:t xml:space="preserve">Embedding model and vector dimension</w:t>
+              <w:rPr>
+                <w:rStyle w:val="VerbatimChar"/>
+              </w:rPr>
+              <w:t xml:space="preserve">embeddinggemma</w:t>
             </w:r>
-          </w:p>
-        </w:tc>
-        <w:tc>
-          <w:tcPr/>
-          <w:p>
-            <w:pPr>
-              <w:pStyle w:val="Compact"/>
-            </w:pPr>
             <w:r>
-              <w:t xml:space="preserve">Proposed</w:t>
+              <w:t xml:space="preserve"> </w:t>
             </w:r>
-          </w:p>
-        </w:tc>
-        <w:tc>
-          <w:tcPr/>
-          <w:p>
-            <w:pPr>
-              <w:pStyle w:val="Compact"/>
-            </w:pPr>
             <w:r>
-              <w:t xml:space="preserve">2026-09-07</w:t>
+              <w:t xml:space="preserve">at 768 dimensions</w:t>
+            </w:r>
+          </w:p>
+        </w:tc>
+        <w:tc>
+          <w:tcPr/>
+          <w:p>
+            <w:pPr>
+              <w:pStyle w:val="Compact"/>
+            </w:pPr>
+            <w:r>
+              <w:t xml:space="preserve">Accepted</w:t>
+            </w:r>
+          </w:p>
+        </w:tc>
+        <w:tc>
+          <w:tcPr/>
+          <w:p>
+            <w:pPr>
+              <w:pStyle w:val="Compact"/>
+            </w:pPr>
+            <w:r>
+              <w:t xml:space="preserve">2026-09-08</w:t>
             </w:r>
           </w:p>
         </w:tc>

</xml_diff>